<commit_message>
Sync application and backend updates
</commit_message>
<xml_diff>
--- a/cau tra loi cua chatbot.docx
+++ b/cau tra loi cua chatbot.docx
@@ -19,10 +19,43 @@
     <w:p>
       <w:pPr>
         <w:jc w:val="both"/>
+        <w:rPr>
+          <w:lang w:val="en-US"/>
+        </w:rPr>
       </w:pPr>
       <w:r>
         <w:t>Phương án nháp HN-0001 — hội nghị kiểm thử 11 (RESCHEDULED) • Thời gian đề xuất: 08:30:00 2/11/2026; địa điểm hồ sơ: Hội trường kiểm thử. • Nhiệm vụ: • Chuẩn bị hội trường và thiết bị — cần admin chọn (chính thức); hạn 08:30:00 30/10/2026 • Gửi giấy mời, xác nhận đại biểu — cần admin chọn (chính thức); hạn 08:30:00 31/10/2026 • Chuẩn bị tài liệu và hậu cần — cần admin chọn (chính thức); hạn 08:30:00 1/11/2026 • Báo cáo viên: • cần admin xác nhận — chính thức; hội nghị kiểm thử 11 • cần admin xác nhận — dự bị; hội nghị kiểm thử 11 • Căn cứ: hạn mức, tải phân công và lịch đã lưu; các nội dung chuyên môn chưa có dữ liệu được đánh dấu để admin rà soát. Đây chỉ là phương án chờ admin phê duyệt. Chưa lưu phân công và chưa gửi thông báo cho người đăng ký.</w:t>
       </w:r>
+    </w:p>
+    <w:p>
+      <w:pPr>
+        <w:jc w:val="both"/>
+      </w:pPr>
+      <w:r>
+        <w:rPr>
+          <w:lang w:val="en-US"/>
+        </w:rPr>
+        <w:t xml:space="preserve">2. </w:t>
+      </w:r>
+      <w:r>
+        <w:t>Giúp tôi đề xuất kế hoạch tập huấn về Luật Trợ giúp pháp lý cho cán bộ phường Trảng Dài; nêu thông tin còn cần làm rõ trước khi chốt.</w:t>
+      </w:r>
+    </w:p>
+    <w:p>
+      <w:pPr>
+        <w:jc w:val="both"/>
+      </w:pPr>
+      <w:r>
+        <w:t>Bản gợi ý kế hoạch (chưa lưu, chưa gửi thông báo): • Đơn vị/địa bàn: UBND phường Trảng Dài • Địa điểm: phường trảng dài Khung sớm hơn không đủ người theo hạn mức; đây là ngày thay thế đã được kiểm tra đủ nhân sự. Khung giờ khả dụng (chưa lưu): 1) 3/11/2026 08:30–11:30; 2) 3/11/2026 13:30–16:30; 3) 9/11/2026 08:30–11:30. Mặc định chọn 3/11/2026 08:30–11:30; có thể đổi trong thẻ xác nhận. • Quy mô dự kiến: 35 người • Chủ đề: Quyền được trợ giúp pháp lý và cách gửi yêu cầu • Tài liệu: Chương trình/kế hoạch hội nghị; Tài liệu pháp luật chính thức còn hiệu lực; Tài liệu hỏi đáp và tình huống thực hành; Danh sách đại biểu, phiếu điểm danh và phiếu đánh giá • Căn cứ gợi ý: Tham khảo 3 hội nghị đã ghi nhận tại UBND phường Trảng Dài; quy mô gợi ý là trung bình số người dự kiến trong các hồ sơ này. Cần đơn vị xác nhận nhu cầu thực tế. • Cán bộ: chính thức Hoàng Minh T, chính thức Lê Thanh H, chính thức Lê Thị C, dự bị Nguyễn Thị B (tối đa 5 nhiệm vụ/tháng, 2/tuần mỗi người; 3 chính thức + 1 dự bị). • Báo cáo viên: chính thức Lê Minh T, dự bị Phan Thị Vân (tối đa 3 lượt/tháng, 1/tuần mỗi người; 1 chính thức + 1 dự bị). • Đơn vị có thể phối hợp: UBND phường Trảng Dài • Nhiệm vụ gợi ý: 4. Xác nhận từng mục bên dưới để điền biểu mẫu; thông báo chỉ gửi sau khi admin xác nhận từng đơn vị.</w:t>
+      </w:r>
+    </w:p>
+    <w:p>
+      <w:pPr>
+        <w:jc w:val="both"/>
+        <w:rPr>
+          <w:lang w:val="en-US"/>
+        </w:rPr>
+      </w:pPr>
     </w:p>
     <w:p/>
     <w:sectPr>

</xml_diff>